<commit_message>
SE modifica fondo de la pantalla modal flujo capital consolidado
</commit_message>
<xml_diff>
--- a/documentacion/ReporteFlujoCapitalConsolidado.docx
+++ b/documentacion/ReporteFlujoCapitalConsolidado.docx
@@ -1604,6 +1604,156 @@
           <w:lang w:val="en-US"/>
         </w:rPr>
       </w:pPr>
+    </w:p>
+    <w:p>
+      <w:pPr>
+        <w:pBdr>
+          <w:bottom w:val="dotted" w:sz="24" w:space="1" w:color="auto"/>
+        </w:pBdr>
+        <w:spacing w:after="0" w:line="240" w:lineRule="auto"/>
+        <w:rPr>
+          <w:lang w:val="en-US"/>
+        </w:rPr>
+      </w:pPr>
+    </w:p>
+    <w:p>
+      <w:pPr>
+        <w:spacing w:after="0" w:line="240" w:lineRule="auto"/>
+        <w:rPr>
+          <w:lang w:val="en-US"/>
+        </w:rPr>
+      </w:pPr>
+    </w:p>
+    <w:p>
+      <w:pPr>
+        <w:spacing w:after="0" w:line="240" w:lineRule="auto"/>
+      </w:pPr>
+      <w:r>
+        <w:t>Vamos ahora a revisar el reporte de Flujo de Capital consolidado. Tiene las siguientes columnas: "Fecha</w:t>
+      </w:r>
+      <w:r>
+        <w:t>,</w:t>
+      </w:r>
+      <w:r>
+        <w:t xml:space="preserve"> Propietario</w:t>
+      </w:r>
+      <w:r>
+        <w:t>,</w:t>
+      </w:r>
+      <w:r>
+        <w:t xml:space="preserve"> Empresa/Emisor</w:t>
+      </w:r>
+      <w:r>
+        <w:t>,</w:t>
+      </w:r>
+      <w:r>
+        <w:t xml:space="preserve"> Interés</w:t>
+      </w:r>
+      <w:r>
+        <w:t>,</w:t>
+      </w:r>
+      <w:r>
+        <w:t xml:space="preserve"> Capital</w:t>
+      </w:r>
+      <w:r>
+        <w:t>,</w:t>
+      </w:r>
+      <w:r>
+        <w:t xml:space="preserve"> Premio </w:t>
+      </w:r>
+      <w:proofErr w:type="spellStart"/>
+      <w:r>
+        <w:t>Int</w:t>
+      </w:r>
+      <w:proofErr w:type="spellEnd"/>
+      <w:r>
+        <w:t>.</w:t>
+      </w:r>
+      <w:r>
+        <w:t>,</w:t>
+      </w:r>
+      <w:r>
+        <w:t xml:space="preserve"> Riesgo Cap.</w:t>
+      </w:r>
+      <w:r>
+        <w:t>,</w:t>
+      </w:r>
+      <w:r>
+        <w:t xml:space="preserve"> Riesgo </w:t>
+      </w:r>
+      <w:proofErr w:type="spellStart"/>
+      <w:r>
+        <w:t>Prem</w:t>
+      </w:r>
+      <w:proofErr w:type="spellEnd"/>
+      <w:r>
+        <w:t>.</w:t>
+      </w:r>
+      <w:r>
+        <w:t>,</w:t>
+      </w:r>
+      <w:r>
+        <w:t xml:space="preserve"> Riesgo Total" </w:t>
+      </w:r>
+    </w:p>
+    <w:p>
+      <w:pPr>
+        <w:spacing w:after="0" w:line="240" w:lineRule="auto"/>
+      </w:pPr>
+      <w:r>
+        <w:t>En cada fila s</w:t>
+      </w:r>
+      <w:r>
+        <w:t>e muestra el consolidado de los fondos que se deben recibir</w:t>
+      </w:r>
+      <w:r>
+        <w:t xml:space="preserve"> por </w:t>
+      </w:r>
+      <w:proofErr w:type="spellStart"/>
+      <w:r>
+        <w:t>dia</w:t>
+      </w:r>
+      <w:proofErr w:type="spellEnd"/>
+      <w:r>
+        <w:t>, propietario Empresa/Emisor. Si hago clic sobre la fila me gustaría ver un modal con el detalle de los componentes de ese pago. En ciertos casos habrá un desglose porque puede ser la suma de varias compras de inversiones realizadas en distintas fechas sobre el mismo instrumento, o bien bonos del estado que corresponden a diferentes instrumentos pero que coinciden con la fecha de la cuota.</w:t>
+      </w:r>
+    </w:p>
+    <w:p>
+      <w:pPr>
+        <w:spacing w:after="0" w:line="240" w:lineRule="auto"/>
+      </w:pPr>
+      <w:r>
+        <w:t xml:space="preserve">Como tema adicional puedo decir que el reporte Flujo capital consolidado no muestra </w:t>
+      </w:r>
+      <w:proofErr w:type="spellStart"/>
+      <w:r>
+        <w:t>id_emisor</w:t>
+      </w:r>
+      <w:proofErr w:type="spellEnd"/>
+      <w:r>
+        <w:t xml:space="preserve">, tampoco el id del propietario. Tal vez debamos modificar el reporte para que estos datos estén </w:t>
+      </w:r>
+      <w:proofErr w:type="gramStart"/>
+      <w:r>
+        <w:t>disponibles</w:t>
+      </w:r>
+      <w:proofErr w:type="gramEnd"/>
+      <w:r>
+        <w:t xml:space="preserve"> pero en forma oculta en el reporte. Luego necesitaremos un </w:t>
+      </w:r>
+      <w:proofErr w:type="spellStart"/>
+      <w:r>
+        <w:t>endpoint</w:t>
+      </w:r>
+      <w:proofErr w:type="spellEnd"/>
+      <w:r>
+        <w:t xml:space="preserve"> al cual le enviaremos como parámetros la fecha, el propietario y el emisor para con estos datos hacer una consulta y mostrar los datos en el modal. </w:t>
+      </w:r>
+      <w:proofErr w:type="gramStart"/>
+      <w:r>
+        <w:t>Estás de acuerdo?</w:t>
+      </w:r>
+      <w:proofErr w:type="gramEnd"/>
     </w:p>
     <w:sectPr>
       <w:pgSz w:w="11906" w:h="16838"/>
@@ -3950,7 +4100,6 @@
   <w:style w:type="character" w:default="1" w:styleId="Fuentedeprrafopredeter">
     <w:name w:val="Default Paragraph Font"/>
     <w:uiPriority w:val="1"/>
-    <w:semiHidden/>
     <w:unhideWhenUsed/>
   </w:style>
   <w:style w:type="table" w:default="1" w:styleId="Tablanormal">

</xml_diff>